<commit_message>
mise à jour pour anto
</commit_message>
<xml_diff>
--- a/doc/Variables pertinentes à add.docx
+++ b/doc/Variables pertinentes à add.docx
@@ -333,13 +333,11 @@
         </w:numPr>
         <w:rPr>
           <w:rFonts w:ascii="Times New Roman" w:hAnsi="Times New Roman" w:cs="Times New Roman"/>
-          <w:highlight w:val="yellow"/>
-        </w:rPr>
-      </w:pPr>
-      <w:r>
-        <w:rPr>
-          <w:rFonts w:ascii="Times New Roman" w:hAnsi="Times New Roman" w:cs="Times New Roman"/>
-          <w:highlight w:val="yellow"/>
+        </w:rPr>
+      </w:pPr>
+      <w:r>
+        <w:rPr>
+          <w:rFonts w:ascii="Times New Roman" w:hAnsi="Times New Roman" w:cs="Times New Roman"/>
         </w:rPr>
         <w:t>Taux de criminalité, qualité de l’air, niveau de bruit</w:t>
       </w:r>
@@ -449,20 +447,17 @@
         </w:numPr>
         <w:rPr>
           <w:rFonts w:ascii="Times New Roman" w:hAnsi="Times New Roman" w:cs="Times New Roman"/>
-          <w:highlight w:val="yellow"/>
-        </w:rPr>
-      </w:pPr>
-      <w:r>
-        <w:rPr>
-          <w:rFonts w:ascii="Times New Roman" w:hAnsi="Times New Roman" w:cs="Times New Roman"/>
-          <w:highlight w:val="yellow"/>
+        </w:rPr>
+      </w:pPr>
+      <w:r>
+        <w:rPr>
+          <w:rFonts w:ascii="Times New Roman" w:hAnsi="Times New Roman" w:cs="Times New Roman"/>
         </w:rPr>
         <w:t>Niveau d’éducation</w:t>
       </w:r>
       <w:r>
         <w:rPr>
           <w:rFonts w:ascii="Times New Roman" w:hAnsi="Times New Roman" w:cs="Times New Roman"/>
-          <w:highlight w:val="yellow"/>
         </w:rPr>
         <w:t xml:space="preserve"> : à trouver </w:t>
       </w:r>

</xml_diff>